<commit_message>
atualizei titutos e conteudos
</commit_message>
<xml_diff>
--- a/MODULOS DE ESTUDO/🎯 CSS.docx
+++ b/MODULOS DE ESTUDO/🎯 CSS.docx
@@ -865,18 +865,7 @@
           <w:sz w:val="24"/>
           <w:szCs w:val="24"/>
         </w:rPr>
-        <w:t>C</w:t>
-      </w:r>
-      <w:r>
-        <w:rPr>
-          <w:rStyle w:val="CdigoHTML"/>
-          <w:rFonts w:asciiTheme="minorHAnsi" w:eastAsiaTheme="majorEastAsia" w:hAnsiTheme="minorHAnsi" w:cstheme="minorHAnsi"/>
-          <w:b/>
-          <w:color w:val="00B0F0"/>
-          <w:sz w:val="24"/>
-          <w:szCs w:val="24"/>
-        </w:rPr>
-        <w:t>lear</w:t>
+        <w:t>Clear</w:t>
       </w:r>
       <w:proofErr w:type="spellEnd"/>
       <w:r>
@@ -951,17 +940,7 @@
           <w:color w:val="004982"/>
           <w:lang w:eastAsia="pt-BR"/>
         </w:rPr>
-        <w:t>O</w:t>
-      </w:r>
-      <w:r>
-        <w:rPr>
-          <w:rFonts w:eastAsia="Times New Roman" w:cstheme="minorHAnsi"/>
-          <w:b/>
-          <w:bCs/>
-          <w:color w:val="004982"/>
-          <w:lang w:eastAsia="pt-BR"/>
-        </w:rPr>
-        <w:t>verflow</w:t>
+        <w:t>Overflow</w:t>
       </w:r>
       <w:r>
         <w:rPr>
@@ -1122,29 +1101,17 @@
         <w:rPr>
           <w:color w:val="00B0F0"/>
         </w:rPr>
-        <w:t>R</w:t>
-      </w:r>
+        <w:t>Relative</w:t>
+      </w:r>
+      <w:proofErr w:type="spellEnd"/>
       <w:r>
         <w:rPr>
           <w:color w:val="00B0F0"/>
         </w:rPr>
-        <w:t>elative</w:t>
-      </w:r>
-      <w:proofErr w:type="spellEnd"/>
-      <w:r>
-        <w:rPr>
-          <w:color w:val="00B0F0"/>
-        </w:rPr>
         <w:t xml:space="preserve">: </w:t>
       </w:r>
       <w:r>
-        <w:t>P</w:t>
-      </w:r>
-      <w:r>
-        <w:t>osicionado em relação à sua posição original</w:t>
-      </w:r>
-      <w:r>
-        <w:t>.</w:t>
+        <w:t>Posicionado em relação à sua posição original.</w:t>
       </w:r>
       <w:r>
         <w:br/>
@@ -1155,10 +1122,7 @@
       </w:r>
       <w:proofErr w:type="gramEnd"/>
       <w:r>
-        <w:t>Propriedades de deslocamento:</w:t>
-      </w:r>
-      <w:r>
-        <w:t xml:space="preserve"> </w:t>
+        <w:t xml:space="preserve">Propriedades de deslocamento: </w:t>
       </w:r>
       <w:r>
         <w:rPr>
@@ -1318,19 +1282,10 @@
         <w:rPr>
           <w:rStyle w:val="Forte"/>
         </w:rPr>
-        <w:t xml:space="preserve"> </w:t>
-      </w:r>
-      <w:r>
-        <w:rPr>
-          <w:rStyle w:val="Forte"/>
-        </w:rPr>
-        <w:t>funcionam</w:t>
-      </w:r>
-      <w:r>
-        <w:t xml:space="preserve"> e posicionam o elemento fixo na tela.</w:t>
-      </w:r>
-      <w:r>
-        <w:t>)</w:t>
+        <w:t xml:space="preserve"> funcionam</w:t>
+      </w:r>
+      <w:r>
+        <w:t xml:space="preserve"> e posicionam o elemento fixo na tela.)</w:t>
       </w:r>
     </w:p>
     <w:p>
@@ -1353,10 +1308,7 @@
         <w:t xml:space="preserve">Stick: </w:t>
       </w:r>
       <w:r>
-        <w:t>A</w:t>
-      </w:r>
-      <w:r>
-        <w:t xml:space="preserve">lterna entre </w:t>
+        <w:t xml:space="preserve">Alterna entre </w:t>
       </w:r>
       <w:proofErr w:type="spellStart"/>
       <w:r>
@@ -1392,10 +1344,7 @@
         <w:t xml:space="preserve"> não funcionam</w:t>
       </w:r>
       <w:r>
-        <w:t xml:space="preserve"> aqui.</w:t>
-      </w:r>
-      <w:r>
-        <w:t>)</w:t>
+        <w:t xml:space="preserve"> aqui.)</w:t>
       </w:r>
     </w:p>
     <w:p>
@@ -1420,10 +1369,7 @@
       </w:r>
       <w:proofErr w:type="spellEnd"/>
       <w:r>
-        <w:t>: padrão; o elemento segue o fluxo normal da página</w:t>
-      </w:r>
-      <w:r>
-        <w:t>.</w:t>
+        <w:t>: padrão; o elemento segue o fluxo normal da página.</w:t>
       </w:r>
       <w:r>
         <w:br/>
@@ -1443,10 +1389,7 @@
         <w:t xml:space="preserve"> funcionam</w:t>
       </w:r>
       <w:r>
-        <w:t xml:space="preserve"> para dizer onde ele “gruda”.</w:t>
-      </w:r>
-      <w:r>
-        <w:t>)</w:t>
+        <w:t xml:space="preserve"> para dizer onde ele “gruda”.)</w:t>
       </w:r>
     </w:p>
     <w:p>
@@ -1592,13 +1535,7 @@
         <w:rPr>
           <w:color w:val="FF0000"/>
         </w:rPr>
-        <w:t xml:space="preserve">: </w:t>
-      </w:r>
-      <w:r>
-        <w:rPr>
-          <w:color w:val="FF0000"/>
-        </w:rPr>
-        <w:t xml:space="preserve">Requer cuidado: pode </w:t>
+        <w:t xml:space="preserve">: Requer cuidado: pode </w:t>
       </w:r>
       <w:r>
         <w:rPr>
@@ -1688,78 +1625,646 @@
           <w:lang w:eastAsia="pt-BR"/>
         </w:rPr>
       </w:pPr>
+      <w:r>
+        <w:rPr>
+          <w:rFonts w:ascii="Times New Roman" w:eastAsia="Times New Roman" w:hAnsi="Times New Roman" w:cs="Times New Roman"/>
+          <w:lang w:eastAsia="pt-BR"/>
+        </w:rPr>
+        <w:br/>
+      </w:r>
+    </w:p>
+    <w:p>
+      <w:pPr>
+        <w:spacing w:after="0"/>
+        <w:rPr>
+          <w:rFonts w:ascii="Times New Roman" w:eastAsia="Times New Roman" w:hAnsi="Times New Roman" w:cs="Times New Roman"/>
+          <w:lang w:eastAsia="pt-BR"/>
+        </w:rPr>
+      </w:pPr>
+    </w:p>
+    <w:p>
+      <w:pPr>
+        <w:pStyle w:val="PargrafodaLista"/>
+        <w:numPr>
+          <w:ilvl w:val="0"/>
+          <w:numId w:val="5"/>
+        </w:numPr>
+        <w:spacing w:after="0"/>
+        <w:rPr>
+          <w:rFonts w:ascii="Times New Roman" w:eastAsia="Times New Roman" w:hAnsi="Times New Roman" w:cs="Times New Roman"/>
+          <w:b/>
+          <w:bCs/>
+          <w:color w:val="004F88"/>
+          <w:lang w:eastAsia="pt-BR"/>
+        </w:rPr>
+      </w:pPr>
+      <w:r>
+        <w:rPr>
+          <w:rFonts w:ascii="Times New Roman" w:eastAsia="Times New Roman" w:hAnsi="Times New Roman" w:cs="Times New Roman"/>
+          <w:b/>
+          <w:bCs/>
+          <w:color w:val="004F88"/>
+          <w:lang w:eastAsia="pt-BR"/>
+        </w:rPr>
+        <w:t>@media</w:t>
+      </w:r>
+      <w:r>
+        <w:rPr>
+          <w:rFonts w:ascii="Times New Roman" w:eastAsia="Times New Roman" w:hAnsi="Times New Roman" w:cs="Times New Roman"/>
+          <w:b/>
+          <w:bCs/>
+          <w:color w:val="004F88"/>
+          <w:lang w:eastAsia="pt-BR"/>
+        </w:rPr>
+        <w:t xml:space="preserve"> </w:t>
+      </w:r>
+      <w:r>
+        <w:rPr>
+          <w:rFonts w:ascii="Times New Roman" w:eastAsia="Times New Roman" w:hAnsi="Times New Roman" w:cs="Times New Roman"/>
+          <w:b/>
+          <w:bCs/>
+          <w:lang w:eastAsia="pt-BR"/>
+        </w:rPr>
+        <w:t>usada para aplicar estilos condicionalmente, dependendo das características do dispositivo (largura, altura, tipo de tela, etc.). Ou seja: criar layouts responsivos, ou seja, que se adaptam a diferentes tamanhos de tela</w:t>
+      </w:r>
+      <w:r>
+        <w:rPr>
+          <w:rFonts w:ascii="Times New Roman" w:eastAsia="Times New Roman" w:hAnsi="Times New Roman" w:cs="Times New Roman"/>
+          <w:b/>
+          <w:bCs/>
+          <w:lang w:eastAsia="pt-BR"/>
+        </w:rPr>
+        <w:t>.</w:t>
+      </w:r>
+    </w:p>
+    <w:p>
+      <w:pPr>
+        <w:spacing w:after="0"/>
+        <w:rPr>
+          <w:rFonts w:ascii="Times New Roman" w:eastAsia="Times New Roman" w:hAnsi="Times New Roman" w:cs="Times New Roman"/>
+          <w:b/>
+          <w:bCs/>
+          <w:color w:val="004F88"/>
+          <w:lang w:eastAsia="pt-BR"/>
+        </w:rPr>
+      </w:pPr>
+      <w:r>
+        <w:rPr>
+          <w:noProof/>
+          <w:lang w:eastAsia="pt-BR"/>
+        </w:rPr>
+        <w:drawing>
+          <wp:inline distT="0" distB="0" distL="0" distR="0" wp14:anchorId="57623EAC" wp14:editId="6F0B3921">
+            <wp:extent cx="5162550" cy="1666875"/>
+            <wp:effectExtent l="0" t="0" r="0" b="9525"/>
+            <wp:docPr id="3" name="Imagem 3"/>
+            <wp:cNvGraphicFramePr>
+              <a:graphicFrameLocks xmlns:a="http://schemas.openxmlformats.org/drawingml/2006/main" noChangeAspect="1"/>
+            </wp:cNvGraphicFramePr>
+            <a:graphic xmlns:a="http://schemas.openxmlformats.org/drawingml/2006/main">
+              <a:graphicData uri="http://schemas.openxmlformats.org/drawingml/2006/picture">
+                <pic:pic xmlns:pic="http://schemas.openxmlformats.org/drawingml/2006/picture">
+                  <pic:nvPicPr>
+                    <pic:cNvPr id="0" name=""/>
+                    <pic:cNvPicPr/>
+                  </pic:nvPicPr>
+                  <pic:blipFill>
+                    <a:blip r:embed="rId8"/>
+                    <a:stretch>
+                      <a:fillRect/>
+                    </a:stretch>
+                  </pic:blipFill>
+                  <pic:spPr>
+                    <a:xfrm>
+                      <a:off x="0" y="0"/>
+                      <a:ext cx="5162550" cy="1666875"/>
+                    </a:xfrm>
+                    <a:prstGeom prst="rect">
+                      <a:avLst/>
+                    </a:prstGeom>
+                  </pic:spPr>
+                </pic:pic>
+              </a:graphicData>
+            </a:graphic>
+          </wp:inline>
+        </w:drawing>
+      </w:r>
+    </w:p>
+    <w:p>
+      <w:pPr>
+        <w:spacing w:after="0"/>
+        <w:ind w:left="360"/>
+        <w:rPr>
+          <w:rFonts w:ascii="Times New Roman" w:eastAsia="Times New Roman" w:hAnsi="Times New Roman" w:cs="Times New Roman"/>
+          <w:b/>
+          <w:bCs/>
+          <w:color w:val="FF0000"/>
+          <w:lang w:eastAsia="pt-BR"/>
+        </w:rPr>
+      </w:pPr>
+      <w:r>
+        <w:rPr>
+          <w:rFonts w:ascii="Times New Roman" w:eastAsia="Times New Roman" w:hAnsi="Times New Roman" w:cs="Times New Roman"/>
+          <w:b/>
+          <w:bCs/>
+          <w:color w:val="FF0000"/>
+          <w:lang w:eastAsia="pt-BR"/>
+        </w:rPr>
+        <w:t>OBS: Propriedades de descolamento:</w:t>
+      </w:r>
+    </w:p>
+    <w:p>
+      <w:pPr>
+        <w:pStyle w:val="PargrafodaLista"/>
+        <w:numPr>
+          <w:ilvl w:val="0"/>
+          <w:numId w:val="28"/>
+        </w:numPr>
+        <w:spacing w:after="0"/>
+        <w:rPr>
+          <w:rFonts w:ascii="Times New Roman" w:eastAsia="Times New Roman" w:hAnsi="Times New Roman" w:cs="Times New Roman"/>
+          <w:b/>
+          <w:bCs/>
+          <w:color w:val="FF0000"/>
+          <w:lang w:eastAsia="pt-BR"/>
+        </w:rPr>
+      </w:pPr>
+      <w:proofErr w:type="spellStart"/>
+      <w:proofErr w:type="gramStart"/>
+      <w:r>
+        <w:rPr>
+          <w:rFonts w:ascii="Times New Roman" w:eastAsia="Times New Roman" w:hAnsi="Times New Roman" w:cs="Times New Roman"/>
+          <w:b/>
+          <w:bCs/>
+          <w:lang w:eastAsia="pt-BR"/>
+        </w:rPr>
+        <w:t>top</w:t>
+      </w:r>
+      <w:proofErr w:type="gramEnd"/>
+      <w:r>
+        <w:rPr>
+          <w:rFonts w:ascii="Times New Roman" w:eastAsia="Times New Roman" w:hAnsi="Times New Roman" w:cs="Times New Roman"/>
+          <w:b/>
+          <w:bCs/>
+          <w:lang w:eastAsia="pt-BR"/>
+        </w:rPr>
+        <w:t>,right,botton,left</w:t>
+      </w:r>
+      <w:proofErr w:type="spellEnd"/>
+      <w:r>
+        <w:rPr>
+          <w:rFonts w:ascii="Times New Roman" w:eastAsia="Times New Roman" w:hAnsi="Times New Roman" w:cs="Times New Roman"/>
+          <w:b/>
+          <w:bCs/>
+          <w:lang w:eastAsia="pt-BR"/>
+        </w:rPr>
+        <w:t>.</w:t>
+      </w:r>
+      <w:r>
+        <w:rPr>
+          <w:rFonts w:ascii="Times New Roman" w:eastAsia="Times New Roman" w:hAnsi="Times New Roman" w:cs="Times New Roman"/>
+          <w:b/>
+          <w:bCs/>
+          <w:color w:val="FF0000"/>
+          <w:lang w:eastAsia="pt-BR"/>
+        </w:rPr>
+        <w:t xml:space="preserve"> </w:t>
+      </w:r>
+    </w:p>
+    <w:p>
+      <w:pPr>
+        <w:spacing w:after="0"/>
+        <w:rPr>
+          <w:rFonts w:ascii="Times New Roman" w:eastAsia="Times New Roman" w:hAnsi="Times New Roman" w:cs="Times New Roman"/>
+          <w:b/>
+          <w:bCs/>
+          <w:color w:val="FF0000"/>
+          <w:lang w:eastAsia="pt-BR"/>
+        </w:rPr>
+      </w:pPr>
+      <w:r>
+        <w:rPr>
+          <w:rFonts w:ascii="Times New Roman" w:eastAsia="Times New Roman" w:hAnsi="Times New Roman" w:cs="Times New Roman"/>
+          <w:b/>
+          <w:bCs/>
+          <w:lang w:eastAsia="pt-BR"/>
+        </w:rPr>
+        <w:t xml:space="preserve">      </w:t>
+      </w:r>
+      <w:r>
+        <w:rPr>
+          <w:rFonts w:ascii="Times New Roman" w:eastAsia="Times New Roman" w:hAnsi="Times New Roman" w:cs="Times New Roman"/>
+          <w:b/>
+          <w:bCs/>
+          <w:color w:val="FF0000"/>
+          <w:lang w:eastAsia="pt-BR"/>
+        </w:rPr>
+        <w:t>Valores de deslocamento:</w:t>
+      </w:r>
+    </w:p>
+    <w:p>
+      <w:pPr>
+        <w:pStyle w:val="PargrafodaLista"/>
+        <w:numPr>
+          <w:ilvl w:val="0"/>
+          <w:numId w:val="28"/>
+        </w:numPr>
+        <w:spacing w:after="0"/>
+        <w:rPr>
+          <w:rFonts w:ascii="Times New Roman" w:eastAsia="Times New Roman" w:hAnsi="Times New Roman" w:cs="Times New Roman"/>
+          <w:bCs/>
+          <w:color w:val="FF0000"/>
+          <w:lang w:eastAsia="pt-BR"/>
+        </w:rPr>
+      </w:pPr>
+      <w:r>
+        <w:rPr>
+          <w:rFonts w:ascii="Times New Roman" w:eastAsia="Times New Roman" w:hAnsi="Times New Roman" w:cs="Times New Roman"/>
+          <w:bCs/>
+          <w:lang w:eastAsia="pt-BR"/>
+        </w:rPr>
+        <w:t xml:space="preserve">Para </w:t>
+      </w:r>
+      <w:r>
+        <w:rPr>
+          <w:rFonts w:ascii="Times New Roman" w:eastAsia="Times New Roman" w:hAnsi="Times New Roman" w:cs="Times New Roman"/>
+          <w:b/>
+          <w:bCs/>
+          <w:color w:val="00B050"/>
+          <w:lang w:eastAsia="pt-BR"/>
+        </w:rPr>
+        <w:t>esquerda</w:t>
+      </w:r>
+      <w:r>
+        <w:rPr>
+          <w:rFonts w:ascii="Times New Roman" w:eastAsia="Times New Roman" w:hAnsi="Times New Roman" w:cs="Times New Roman"/>
+          <w:bCs/>
+          <w:lang w:eastAsia="pt-BR"/>
+        </w:rPr>
+        <w:t xml:space="preserve">: valores </w:t>
+      </w:r>
+      <w:r>
+        <w:rPr>
+          <w:rFonts w:ascii="Times New Roman" w:eastAsia="Times New Roman" w:hAnsi="Times New Roman" w:cs="Times New Roman"/>
+          <w:b/>
+          <w:bCs/>
+          <w:color w:val="00B050"/>
+          <w:lang w:eastAsia="pt-BR"/>
+        </w:rPr>
+        <w:t>menores</w:t>
+      </w:r>
+      <w:r>
+        <w:rPr>
+          <w:rFonts w:ascii="Times New Roman" w:eastAsia="Times New Roman" w:hAnsi="Times New Roman" w:cs="Times New Roman"/>
+          <w:bCs/>
+          <w:color w:val="00B050"/>
+          <w:lang w:eastAsia="pt-BR"/>
+        </w:rPr>
+        <w:t xml:space="preserve"> </w:t>
+      </w:r>
+      <w:r>
+        <w:rPr>
+          <w:rFonts w:ascii="Times New Roman" w:eastAsia="Times New Roman" w:hAnsi="Times New Roman" w:cs="Times New Roman"/>
+          <w:bCs/>
+          <w:lang w:eastAsia="pt-BR"/>
+        </w:rPr>
+        <w:t>que original;</w:t>
+      </w:r>
+    </w:p>
+    <w:p>
+      <w:pPr>
+        <w:pStyle w:val="PargrafodaLista"/>
+        <w:numPr>
+          <w:ilvl w:val="0"/>
+          <w:numId w:val="28"/>
+        </w:numPr>
+        <w:spacing w:after="0"/>
+        <w:rPr>
+          <w:rFonts w:ascii="Times New Roman" w:eastAsia="Times New Roman" w:hAnsi="Times New Roman" w:cs="Times New Roman"/>
+          <w:bCs/>
+          <w:color w:val="FF0000"/>
+          <w:lang w:eastAsia="pt-BR"/>
+        </w:rPr>
+      </w:pPr>
+      <w:r>
+        <w:rPr>
+          <w:rFonts w:ascii="Times New Roman" w:eastAsia="Times New Roman" w:hAnsi="Times New Roman" w:cs="Times New Roman"/>
+          <w:bCs/>
+          <w:lang w:eastAsia="pt-BR"/>
+        </w:rPr>
+        <w:t xml:space="preserve">Para </w:t>
+      </w:r>
+      <w:r>
+        <w:rPr>
+          <w:rFonts w:ascii="Times New Roman" w:eastAsia="Times New Roman" w:hAnsi="Times New Roman" w:cs="Times New Roman"/>
+          <w:b/>
+          <w:bCs/>
+          <w:color w:val="00B0F0"/>
+          <w:lang w:eastAsia="pt-BR"/>
+        </w:rPr>
+        <w:t>direita</w:t>
+      </w:r>
+      <w:r>
+        <w:rPr>
+          <w:rFonts w:ascii="Times New Roman" w:eastAsia="Times New Roman" w:hAnsi="Times New Roman" w:cs="Times New Roman"/>
+          <w:bCs/>
+          <w:lang w:eastAsia="pt-BR"/>
+        </w:rPr>
+        <w:t>:</w:t>
+      </w:r>
+      <w:r>
+        <w:rPr>
+          <w:rFonts w:ascii="Times New Roman" w:eastAsia="Times New Roman" w:hAnsi="Times New Roman" w:cs="Times New Roman"/>
+          <w:bCs/>
+          <w:color w:val="FF0000"/>
+          <w:lang w:eastAsia="pt-BR"/>
+        </w:rPr>
+        <w:t xml:space="preserve"> </w:t>
+      </w:r>
+      <w:r>
+        <w:rPr>
+          <w:rFonts w:ascii="Times New Roman" w:eastAsia="Times New Roman" w:hAnsi="Times New Roman" w:cs="Times New Roman"/>
+          <w:bCs/>
+          <w:lang w:eastAsia="pt-BR"/>
+        </w:rPr>
+        <w:t xml:space="preserve">valores </w:t>
+      </w:r>
+      <w:r>
+        <w:rPr>
+          <w:rFonts w:ascii="Times New Roman" w:eastAsia="Times New Roman" w:hAnsi="Times New Roman" w:cs="Times New Roman"/>
+          <w:b/>
+          <w:bCs/>
+          <w:color w:val="00B0F0"/>
+          <w:lang w:eastAsia="pt-BR"/>
+        </w:rPr>
+        <w:t>maiores</w:t>
+      </w:r>
+      <w:r>
+        <w:rPr>
+          <w:rFonts w:ascii="Times New Roman" w:eastAsia="Times New Roman" w:hAnsi="Times New Roman" w:cs="Times New Roman"/>
+          <w:bCs/>
+          <w:color w:val="00B0F0"/>
+          <w:lang w:eastAsia="pt-BR"/>
+        </w:rPr>
+        <w:t xml:space="preserve"> </w:t>
+      </w:r>
+      <w:r>
+        <w:rPr>
+          <w:rFonts w:ascii="Times New Roman" w:eastAsia="Times New Roman" w:hAnsi="Times New Roman" w:cs="Times New Roman"/>
+          <w:bCs/>
+          <w:lang w:eastAsia="pt-BR"/>
+        </w:rPr>
+        <w:t>que original;</w:t>
+      </w:r>
+    </w:p>
+    <w:p>
+      <w:pPr>
+        <w:pStyle w:val="PargrafodaLista"/>
+        <w:numPr>
+          <w:ilvl w:val="0"/>
+          <w:numId w:val="28"/>
+        </w:numPr>
+        <w:spacing w:after="0"/>
+        <w:rPr>
+          <w:rFonts w:ascii="Times New Roman" w:eastAsia="Times New Roman" w:hAnsi="Times New Roman" w:cs="Times New Roman"/>
+          <w:bCs/>
+          <w:color w:val="FF0000"/>
+          <w:lang w:eastAsia="pt-BR"/>
+        </w:rPr>
+      </w:pPr>
+      <w:r>
+        <w:rPr>
+          <w:rFonts w:ascii="Times New Roman" w:eastAsia="Times New Roman" w:hAnsi="Times New Roman" w:cs="Times New Roman"/>
+          <w:bCs/>
+          <w:lang w:eastAsia="pt-BR"/>
+        </w:rPr>
+        <w:t xml:space="preserve">Para </w:t>
+      </w:r>
+      <w:r>
+        <w:rPr>
+          <w:rFonts w:ascii="Times New Roman" w:eastAsia="Times New Roman" w:hAnsi="Times New Roman" w:cs="Times New Roman"/>
+          <w:b/>
+          <w:bCs/>
+          <w:color w:val="00B050"/>
+          <w:lang w:eastAsia="pt-BR"/>
+        </w:rPr>
+        <w:t>cima</w:t>
+      </w:r>
+      <w:r>
+        <w:rPr>
+          <w:rFonts w:ascii="Times New Roman" w:eastAsia="Times New Roman" w:hAnsi="Times New Roman" w:cs="Times New Roman"/>
+          <w:bCs/>
+          <w:lang w:eastAsia="pt-BR"/>
+        </w:rPr>
+        <w:t>:</w:t>
+      </w:r>
+      <w:r>
+        <w:rPr>
+          <w:rFonts w:ascii="Times New Roman" w:eastAsia="Times New Roman" w:hAnsi="Times New Roman" w:cs="Times New Roman"/>
+          <w:bCs/>
+          <w:color w:val="FF0000"/>
+          <w:lang w:eastAsia="pt-BR"/>
+        </w:rPr>
+        <w:t xml:space="preserve"> </w:t>
+      </w:r>
+      <w:r>
+        <w:rPr>
+          <w:rFonts w:ascii="Times New Roman" w:eastAsia="Times New Roman" w:hAnsi="Times New Roman" w:cs="Times New Roman"/>
+          <w:bCs/>
+          <w:lang w:eastAsia="pt-BR"/>
+        </w:rPr>
+        <w:t xml:space="preserve">valores </w:t>
+      </w:r>
+      <w:r>
+        <w:rPr>
+          <w:rFonts w:ascii="Times New Roman" w:eastAsia="Times New Roman" w:hAnsi="Times New Roman" w:cs="Times New Roman"/>
+          <w:b/>
+          <w:bCs/>
+          <w:color w:val="00B050"/>
+          <w:lang w:eastAsia="pt-BR"/>
+        </w:rPr>
+        <w:t>menores</w:t>
+      </w:r>
+      <w:r>
+        <w:rPr>
+          <w:rFonts w:ascii="Times New Roman" w:eastAsia="Times New Roman" w:hAnsi="Times New Roman" w:cs="Times New Roman"/>
+          <w:bCs/>
+          <w:color w:val="00B050"/>
+          <w:lang w:eastAsia="pt-BR"/>
+        </w:rPr>
+        <w:t xml:space="preserve"> </w:t>
+      </w:r>
+      <w:r>
+        <w:rPr>
+          <w:rFonts w:ascii="Times New Roman" w:eastAsia="Times New Roman" w:hAnsi="Times New Roman" w:cs="Times New Roman"/>
+          <w:bCs/>
+          <w:lang w:eastAsia="pt-BR"/>
+        </w:rPr>
+        <w:t>que original;</w:t>
+      </w:r>
+    </w:p>
+    <w:p>
+      <w:pPr>
+        <w:pStyle w:val="PargrafodaLista"/>
+        <w:numPr>
+          <w:ilvl w:val="0"/>
+          <w:numId w:val="28"/>
+        </w:numPr>
+        <w:spacing w:after="0"/>
+        <w:rPr>
+          <w:rFonts w:ascii="Times New Roman" w:eastAsia="Times New Roman" w:hAnsi="Times New Roman" w:cs="Times New Roman"/>
+          <w:b/>
+          <w:bCs/>
+          <w:color w:val="FF0000"/>
+          <w:lang w:eastAsia="pt-BR"/>
+        </w:rPr>
+      </w:pPr>
+      <w:r>
+        <w:rPr>
+          <w:rFonts w:ascii="Times New Roman" w:eastAsia="Times New Roman" w:hAnsi="Times New Roman" w:cs="Times New Roman"/>
+          <w:bCs/>
+          <w:lang w:eastAsia="pt-BR"/>
+        </w:rPr>
+        <w:t xml:space="preserve">Para </w:t>
+      </w:r>
+      <w:r>
+        <w:rPr>
+          <w:rFonts w:ascii="Times New Roman" w:eastAsia="Times New Roman" w:hAnsi="Times New Roman" w:cs="Times New Roman"/>
+          <w:b/>
+          <w:bCs/>
+          <w:color w:val="00B0F0"/>
+          <w:lang w:eastAsia="pt-BR"/>
+        </w:rPr>
+        <w:t>baixo</w:t>
+      </w:r>
+      <w:r>
+        <w:rPr>
+          <w:rFonts w:ascii="Times New Roman" w:eastAsia="Times New Roman" w:hAnsi="Times New Roman" w:cs="Times New Roman"/>
+          <w:bCs/>
+          <w:lang w:eastAsia="pt-BR"/>
+        </w:rPr>
+        <w:t>:</w:t>
+      </w:r>
+      <w:r>
+        <w:rPr>
+          <w:rFonts w:ascii="Times New Roman" w:eastAsia="Times New Roman" w:hAnsi="Times New Roman" w:cs="Times New Roman"/>
+          <w:bCs/>
+          <w:color w:val="FF0000"/>
+          <w:lang w:eastAsia="pt-BR"/>
+        </w:rPr>
+        <w:t xml:space="preserve"> </w:t>
+      </w:r>
+      <w:r>
+        <w:rPr>
+          <w:rFonts w:ascii="Times New Roman" w:eastAsia="Times New Roman" w:hAnsi="Times New Roman" w:cs="Times New Roman"/>
+          <w:bCs/>
+          <w:lang w:eastAsia="pt-BR"/>
+        </w:rPr>
+        <w:t xml:space="preserve">valores </w:t>
+      </w:r>
+      <w:r>
+        <w:rPr>
+          <w:rFonts w:ascii="Times New Roman" w:eastAsia="Times New Roman" w:hAnsi="Times New Roman" w:cs="Times New Roman"/>
+          <w:b/>
+          <w:bCs/>
+          <w:color w:val="00B0F0"/>
+          <w:lang w:eastAsia="pt-BR"/>
+        </w:rPr>
+        <w:t>maiores</w:t>
+      </w:r>
+      <w:r>
+        <w:rPr>
+          <w:rFonts w:ascii="Times New Roman" w:eastAsia="Times New Roman" w:hAnsi="Times New Roman" w:cs="Times New Roman"/>
+          <w:bCs/>
+          <w:color w:val="00B0F0"/>
+          <w:lang w:eastAsia="pt-BR"/>
+        </w:rPr>
+        <w:t xml:space="preserve"> </w:t>
+      </w:r>
+      <w:r>
+        <w:rPr>
+          <w:rFonts w:ascii="Times New Roman" w:eastAsia="Times New Roman" w:hAnsi="Times New Roman" w:cs="Times New Roman"/>
+          <w:bCs/>
+          <w:lang w:eastAsia="pt-BR"/>
+        </w:rPr>
+        <w:t>que original</w:t>
+      </w:r>
+      <w:r>
+        <w:rPr>
+          <w:rFonts w:ascii="Times New Roman" w:eastAsia="Times New Roman" w:hAnsi="Times New Roman" w:cs="Times New Roman"/>
+          <w:b/>
+          <w:bCs/>
+          <w:lang w:eastAsia="pt-BR"/>
+        </w:rPr>
+        <w:t>;</w:t>
+      </w:r>
+    </w:p>
+    <w:p>
+      <w:pPr>
+        <w:spacing w:after="0"/>
+        <w:rPr>
+          <w:rFonts w:ascii="Times New Roman" w:eastAsia="Times New Roman" w:hAnsi="Times New Roman" w:cs="Times New Roman"/>
+          <w:b/>
+          <w:bCs/>
+          <w:color w:val="FF0000"/>
+          <w:lang w:eastAsia="pt-BR"/>
+        </w:rPr>
+      </w:pPr>
+    </w:p>
+    <w:p>
+      <w:pPr>
+        <w:spacing w:after="0"/>
+        <w:rPr>
+          <w:rFonts w:ascii="Times New Roman" w:eastAsia="Times New Roman" w:hAnsi="Times New Roman" w:cs="Times New Roman"/>
+          <w:b/>
+          <w:bCs/>
+          <w:color w:val="FF0000"/>
+          <w:lang w:eastAsia="pt-BR"/>
+        </w:rPr>
+      </w:pPr>
+    </w:p>
+    <w:p>
+      <w:pPr>
+        <w:spacing w:after="0"/>
+        <w:rPr>
+          <w:rFonts w:ascii="Times New Roman" w:eastAsia="Times New Roman" w:hAnsi="Times New Roman" w:cs="Times New Roman"/>
+          <w:b/>
+          <w:bCs/>
+          <w:color w:val="FF0000"/>
+          <w:lang w:eastAsia="pt-BR"/>
+        </w:rPr>
+      </w:pPr>
+    </w:p>
+    <w:p>
+      <w:pPr>
+        <w:spacing w:after="0"/>
+        <w:rPr>
+          <w:rFonts w:ascii="Times New Roman" w:eastAsia="Times New Roman" w:hAnsi="Times New Roman" w:cs="Times New Roman"/>
+          <w:b/>
+          <w:bCs/>
+          <w:color w:val="FF0000"/>
+          <w:lang w:eastAsia="pt-BR"/>
+        </w:rPr>
+      </w:pPr>
       <w:bookmarkStart w:id="0" w:name="_GoBack"/>
       <w:bookmarkEnd w:id="0"/>
-      <w:r>
-        <w:rPr>
-          <w:rFonts w:ascii="Times New Roman" w:eastAsia="Times New Roman" w:hAnsi="Times New Roman" w:cs="Times New Roman"/>
-          <w:lang w:eastAsia="pt-BR"/>
-        </w:rPr>
-        <w:br/>
-      </w:r>
-    </w:p>
-    <w:p>
-      <w:pPr>
-        <w:spacing w:after="0"/>
-        <w:rPr>
-          <w:rFonts w:ascii="Times New Roman" w:eastAsia="Times New Roman" w:hAnsi="Times New Roman" w:cs="Times New Roman"/>
-          <w:lang w:eastAsia="pt-BR"/>
-        </w:rPr>
-      </w:pPr>
-    </w:p>
-    <w:p>
-      <w:pPr>
-        <w:pStyle w:val="PargrafodaLista"/>
+    </w:p>
+    <w:p>
+      <w:pPr>
         <w:numPr>
           <w:ilvl w:val="0"/>
-          <w:numId w:val="5"/>
-        </w:numPr>
-        <w:spacing w:after="0"/>
-        <w:rPr>
-          <w:rFonts w:ascii="Times New Roman" w:eastAsia="Times New Roman" w:hAnsi="Times New Roman" w:cs="Times New Roman"/>
-          <w:b/>
-          <w:bCs/>
-          <w:color w:val="004F88"/>
-          <w:lang w:eastAsia="pt-BR"/>
-        </w:rPr>
-      </w:pPr>
-      <w:r>
-        <w:rPr>
-          <w:rFonts w:ascii="Times New Roman" w:eastAsia="Times New Roman" w:hAnsi="Times New Roman" w:cs="Times New Roman"/>
-          <w:b/>
-          <w:bCs/>
-          <w:color w:val="004F88"/>
-          <w:lang w:eastAsia="pt-BR"/>
-        </w:rPr>
-        <w:t>@media</w:t>
-      </w:r>
-      <w:r>
-        <w:rPr>
-          <w:rFonts w:ascii="Times New Roman" w:eastAsia="Times New Roman" w:hAnsi="Times New Roman" w:cs="Times New Roman"/>
-          <w:b/>
-          <w:bCs/>
-          <w:color w:val="004F88"/>
-          <w:lang w:eastAsia="pt-BR"/>
-        </w:rPr>
-        <w:t xml:space="preserve"> </w:t>
-      </w:r>
-      <w:r>
-        <w:rPr>
-          <w:rFonts w:ascii="Times New Roman" w:eastAsia="Times New Roman" w:hAnsi="Times New Roman" w:cs="Times New Roman"/>
-          <w:b/>
-          <w:bCs/>
-          <w:lang w:eastAsia="pt-BR"/>
-        </w:rPr>
-        <w:t>usada para aplicar estilos condicionalmente, dependendo das características do dispositivo (largura, altura, tipo de tela, etc.). Ou seja: criar layouts responsivos, ou seja, que se adaptam a diferentes tamanhos de tela</w:t>
-      </w:r>
-      <w:r>
-        <w:rPr>
-          <w:rFonts w:ascii="Times New Roman" w:eastAsia="Times New Roman" w:hAnsi="Times New Roman" w:cs="Times New Roman"/>
-          <w:b/>
-          <w:bCs/>
-          <w:lang w:eastAsia="pt-BR"/>
-        </w:rPr>
-        <w:t>.</w:t>
+          <w:numId w:val="4"/>
+        </w:numPr>
+      </w:pPr>
+      <w:r>
+        <w:rPr>
+          <w:rFonts w:ascii="Segoe UI Emoji" w:hAnsi="Segoe UI Emoji" w:cs="Segoe UI Emoji"/>
+        </w:rPr>
+        <w:lastRenderedPageBreak/>
+        <w:t>📌</w:t>
+      </w:r>
+      <w:r>
+        <w:t xml:space="preserve"> FLEXBOX/GRID – ORGANIZA LAYOUTS DE FORMA DINÂMICA</w:t>
       </w:r>
     </w:p>
     <w:p>
@@ -1767,513 +2272,50 @@
         <w:spacing w:after="0"/>
         <w:ind w:left="360"/>
         <w:rPr>
-          <w:rFonts w:ascii="Times New Roman" w:eastAsia="Times New Roman" w:hAnsi="Times New Roman" w:cs="Times New Roman"/>
-          <w:b/>
-          <w:bCs/>
-          <w:color w:val="FF0000"/>
-          <w:lang w:eastAsia="pt-BR"/>
-        </w:rPr>
-      </w:pPr>
-      <w:r>
-        <w:rPr>
-          <w:rFonts w:ascii="Times New Roman" w:eastAsia="Times New Roman" w:hAnsi="Times New Roman" w:cs="Times New Roman"/>
-          <w:b/>
-          <w:bCs/>
-          <w:color w:val="FF0000"/>
-          <w:lang w:eastAsia="pt-BR"/>
-        </w:rPr>
-        <w:t>OBS: Propriedades de descolamento:</w:t>
-      </w:r>
-    </w:p>
-    <w:p>
-      <w:pPr>
-        <w:pStyle w:val="PargrafodaLista"/>
-        <w:numPr>
-          <w:ilvl w:val="0"/>
-          <w:numId w:val="28"/>
-        </w:numPr>
-        <w:spacing w:after="0"/>
-        <w:rPr>
-          <w:rFonts w:ascii="Times New Roman" w:eastAsia="Times New Roman" w:hAnsi="Times New Roman" w:cs="Times New Roman"/>
-          <w:b/>
-          <w:bCs/>
-          <w:color w:val="FF0000"/>
-          <w:lang w:eastAsia="pt-BR"/>
-        </w:rPr>
-      </w:pPr>
-      <w:proofErr w:type="spellStart"/>
+          <w:rFonts w:eastAsia="Times New Roman"/>
+          <w:lang w:eastAsia="pt-BR"/>
+        </w:rPr>
+      </w:pPr>
       <w:proofErr w:type="gramStart"/>
       <w:r>
         <w:rPr>
-          <w:rFonts w:ascii="Times New Roman" w:eastAsia="Times New Roman" w:hAnsi="Times New Roman" w:cs="Times New Roman"/>
-          <w:b/>
-          <w:bCs/>
-          <w:lang w:eastAsia="pt-BR"/>
-        </w:rPr>
-        <w:t>top</w:t>
+          <w:rFonts w:eastAsia="Times New Roman"/>
+          <w:color w:val="004E9A"/>
+          <w:lang w:eastAsia="pt-BR"/>
+        </w:rPr>
+        <w:t>display</w:t>
       </w:r>
       <w:proofErr w:type="gramEnd"/>
       <w:r>
         <w:rPr>
-          <w:rFonts w:ascii="Times New Roman" w:eastAsia="Times New Roman" w:hAnsi="Times New Roman" w:cs="Times New Roman"/>
-          <w:b/>
-          <w:bCs/>
-          <w:lang w:eastAsia="pt-BR"/>
-        </w:rPr>
-        <w:t>,right,botton,left</w:t>
-      </w:r>
-      <w:proofErr w:type="spellEnd"/>
-      <w:r>
-        <w:rPr>
-          <w:rFonts w:ascii="Times New Roman" w:eastAsia="Times New Roman" w:hAnsi="Times New Roman" w:cs="Times New Roman"/>
-          <w:b/>
-          <w:bCs/>
-          <w:lang w:eastAsia="pt-BR"/>
-        </w:rPr>
-        <w:t>.</w:t>
-      </w:r>
-      <w:r>
-        <w:rPr>
-          <w:rFonts w:ascii="Times New Roman" w:eastAsia="Times New Roman" w:hAnsi="Times New Roman" w:cs="Times New Roman"/>
-          <w:b/>
-          <w:bCs/>
-          <w:color w:val="FF0000"/>
-          <w:lang w:eastAsia="pt-BR"/>
-        </w:rPr>
-        <w:t xml:space="preserve"> </w:t>
-      </w:r>
-    </w:p>
-    <w:p>
-      <w:pPr>
-        <w:spacing w:after="0"/>
-        <w:rPr>
-          <w:rFonts w:ascii="Times New Roman" w:eastAsia="Times New Roman" w:hAnsi="Times New Roman" w:cs="Times New Roman"/>
-          <w:b/>
-          <w:bCs/>
-          <w:color w:val="FF0000"/>
-          <w:lang w:eastAsia="pt-BR"/>
-        </w:rPr>
-      </w:pPr>
-      <w:r>
-        <w:rPr>
-          <w:rFonts w:ascii="Times New Roman" w:eastAsia="Times New Roman" w:hAnsi="Times New Roman" w:cs="Times New Roman"/>
-          <w:b/>
-          <w:bCs/>
-          <w:lang w:eastAsia="pt-BR"/>
-        </w:rPr>
-        <w:t xml:space="preserve">      </w:t>
-      </w:r>
-      <w:r>
-        <w:rPr>
-          <w:rFonts w:ascii="Times New Roman" w:eastAsia="Times New Roman" w:hAnsi="Times New Roman" w:cs="Times New Roman"/>
-          <w:b/>
-          <w:bCs/>
-          <w:color w:val="FF0000"/>
-          <w:lang w:eastAsia="pt-BR"/>
-        </w:rPr>
-        <w:t>Valores de deslocamento:</w:t>
-      </w:r>
-    </w:p>
-    <w:p>
-      <w:pPr>
-        <w:pStyle w:val="PargrafodaLista"/>
-        <w:numPr>
-          <w:ilvl w:val="0"/>
-          <w:numId w:val="28"/>
-        </w:numPr>
-        <w:spacing w:after="0"/>
-        <w:rPr>
-          <w:rFonts w:ascii="Times New Roman" w:eastAsia="Times New Roman" w:hAnsi="Times New Roman" w:cs="Times New Roman"/>
-          <w:bCs/>
-          <w:color w:val="FF0000"/>
-          <w:lang w:eastAsia="pt-BR"/>
-        </w:rPr>
-      </w:pPr>
-      <w:r>
-        <w:rPr>
-          <w:rFonts w:ascii="Times New Roman" w:eastAsia="Times New Roman" w:hAnsi="Times New Roman" w:cs="Times New Roman"/>
-          <w:bCs/>
-          <w:lang w:eastAsia="pt-BR"/>
-        </w:rPr>
-        <w:t xml:space="preserve">Para </w:t>
-      </w:r>
-      <w:r>
-        <w:rPr>
-          <w:rFonts w:ascii="Times New Roman" w:eastAsia="Times New Roman" w:hAnsi="Times New Roman" w:cs="Times New Roman"/>
-          <w:b/>
-          <w:bCs/>
-          <w:color w:val="00B050"/>
-          <w:lang w:eastAsia="pt-BR"/>
-        </w:rPr>
-        <w:t>esquerda</w:t>
-      </w:r>
-      <w:r>
-        <w:rPr>
-          <w:rFonts w:ascii="Times New Roman" w:eastAsia="Times New Roman" w:hAnsi="Times New Roman" w:cs="Times New Roman"/>
-          <w:bCs/>
-          <w:lang w:eastAsia="pt-BR"/>
-        </w:rPr>
-        <w:t xml:space="preserve">: valores </w:t>
-      </w:r>
-      <w:r>
-        <w:rPr>
-          <w:rFonts w:ascii="Times New Roman" w:eastAsia="Times New Roman" w:hAnsi="Times New Roman" w:cs="Times New Roman"/>
-          <w:b/>
-          <w:bCs/>
-          <w:color w:val="00B050"/>
-          <w:lang w:eastAsia="pt-BR"/>
-        </w:rPr>
-        <w:t>menores</w:t>
-      </w:r>
-      <w:r>
-        <w:rPr>
-          <w:rFonts w:ascii="Times New Roman" w:eastAsia="Times New Roman" w:hAnsi="Times New Roman" w:cs="Times New Roman"/>
-          <w:bCs/>
-          <w:color w:val="00B050"/>
-          <w:lang w:eastAsia="pt-BR"/>
-        </w:rPr>
-        <w:t xml:space="preserve"> </w:t>
-      </w:r>
-      <w:r>
-        <w:rPr>
-          <w:rFonts w:ascii="Times New Roman" w:eastAsia="Times New Roman" w:hAnsi="Times New Roman" w:cs="Times New Roman"/>
-          <w:bCs/>
-          <w:lang w:eastAsia="pt-BR"/>
-        </w:rPr>
-        <w:t>que original;</w:t>
-      </w:r>
-    </w:p>
-    <w:p>
-      <w:pPr>
-        <w:pStyle w:val="PargrafodaLista"/>
-        <w:numPr>
-          <w:ilvl w:val="0"/>
-          <w:numId w:val="28"/>
-        </w:numPr>
-        <w:spacing w:after="0"/>
-        <w:rPr>
-          <w:rFonts w:ascii="Times New Roman" w:eastAsia="Times New Roman" w:hAnsi="Times New Roman" w:cs="Times New Roman"/>
-          <w:bCs/>
-          <w:color w:val="FF0000"/>
-          <w:lang w:eastAsia="pt-BR"/>
-        </w:rPr>
-      </w:pPr>
-      <w:r>
-        <w:rPr>
-          <w:rFonts w:ascii="Times New Roman" w:eastAsia="Times New Roman" w:hAnsi="Times New Roman" w:cs="Times New Roman"/>
-          <w:bCs/>
-          <w:lang w:eastAsia="pt-BR"/>
-        </w:rPr>
-        <w:t xml:space="preserve">Para </w:t>
-      </w:r>
-      <w:r>
-        <w:rPr>
-          <w:rFonts w:ascii="Times New Roman" w:eastAsia="Times New Roman" w:hAnsi="Times New Roman" w:cs="Times New Roman"/>
-          <w:b/>
-          <w:bCs/>
-          <w:color w:val="00B0F0"/>
-          <w:lang w:eastAsia="pt-BR"/>
-        </w:rPr>
-        <w:t>direita</w:t>
-      </w:r>
-      <w:r>
-        <w:rPr>
-          <w:rFonts w:ascii="Times New Roman" w:eastAsia="Times New Roman" w:hAnsi="Times New Roman" w:cs="Times New Roman"/>
-          <w:bCs/>
-          <w:lang w:eastAsia="pt-BR"/>
-        </w:rPr>
-        <w:t>:</w:t>
-      </w:r>
-      <w:r>
-        <w:rPr>
-          <w:rFonts w:ascii="Times New Roman" w:eastAsia="Times New Roman" w:hAnsi="Times New Roman" w:cs="Times New Roman"/>
-          <w:bCs/>
-          <w:color w:val="FF0000"/>
-          <w:lang w:eastAsia="pt-BR"/>
-        </w:rPr>
-        <w:t xml:space="preserve"> </w:t>
-      </w:r>
-      <w:r>
-        <w:rPr>
-          <w:rFonts w:ascii="Times New Roman" w:eastAsia="Times New Roman" w:hAnsi="Times New Roman" w:cs="Times New Roman"/>
-          <w:bCs/>
-          <w:lang w:eastAsia="pt-BR"/>
-        </w:rPr>
-        <w:t xml:space="preserve">valores </w:t>
-      </w:r>
-      <w:r>
-        <w:rPr>
-          <w:rFonts w:ascii="Times New Roman" w:eastAsia="Times New Roman" w:hAnsi="Times New Roman" w:cs="Times New Roman"/>
-          <w:b/>
-          <w:bCs/>
-          <w:color w:val="00B0F0"/>
-          <w:lang w:eastAsia="pt-BR"/>
-        </w:rPr>
-        <w:t>maiores</w:t>
-      </w:r>
-      <w:r>
-        <w:rPr>
-          <w:rFonts w:ascii="Times New Roman" w:eastAsia="Times New Roman" w:hAnsi="Times New Roman" w:cs="Times New Roman"/>
-          <w:bCs/>
-          <w:color w:val="00B0F0"/>
-          <w:lang w:eastAsia="pt-BR"/>
-        </w:rPr>
-        <w:t xml:space="preserve"> </w:t>
-      </w:r>
-      <w:r>
-        <w:rPr>
-          <w:rFonts w:ascii="Times New Roman" w:eastAsia="Times New Roman" w:hAnsi="Times New Roman" w:cs="Times New Roman"/>
-          <w:bCs/>
-          <w:lang w:eastAsia="pt-BR"/>
-        </w:rPr>
-        <w:t>que original;</w:t>
-      </w:r>
-    </w:p>
-    <w:p>
-      <w:pPr>
-        <w:pStyle w:val="PargrafodaLista"/>
-        <w:numPr>
-          <w:ilvl w:val="0"/>
-          <w:numId w:val="28"/>
-        </w:numPr>
-        <w:spacing w:after="0"/>
-        <w:rPr>
-          <w:rFonts w:ascii="Times New Roman" w:eastAsia="Times New Roman" w:hAnsi="Times New Roman" w:cs="Times New Roman"/>
-          <w:bCs/>
-          <w:color w:val="FF0000"/>
-          <w:lang w:eastAsia="pt-BR"/>
-        </w:rPr>
-      </w:pPr>
-      <w:r>
-        <w:rPr>
-          <w:rFonts w:ascii="Times New Roman" w:eastAsia="Times New Roman" w:hAnsi="Times New Roman" w:cs="Times New Roman"/>
-          <w:bCs/>
-          <w:lang w:eastAsia="pt-BR"/>
-        </w:rPr>
-        <w:t xml:space="preserve">Para </w:t>
-      </w:r>
-      <w:r>
-        <w:rPr>
-          <w:rFonts w:ascii="Times New Roman" w:eastAsia="Times New Roman" w:hAnsi="Times New Roman" w:cs="Times New Roman"/>
-          <w:b/>
-          <w:bCs/>
-          <w:color w:val="00B050"/>
-          <w:lang w:eastAsia="pt-BR"/>
-        </w:rPr>
-        <w:t>cima</w:t>
-      </w:r>
-      <w:r>
-        <w:rPr>
-          <w:rFonts w:ascii="Times New Roman" w:eastAsia="Times New Roman" w:hAnsi="Times New Roman" w:cs="Times New Roman"/>
-          <w:bCs/>
-          <w:lang w:eastAsia="pt-BR"/>
-        </w:rPr>
-        <w:t>:</w:t>
-      </w:r>
-      <w:r>
-        <w:rPr>
-          <w:rFonts w:ascii="Times New Roman" w:eastAsia="Times New Roman" w:hAnsi="Times New Roman" w:cs="Times New Roman"/>
-          <w:bCs/>
-          <w:color w:val="FF0000"/>
-          <w:lang w:eastAsia="pt-BR"/>
-        </w:rPr>
-        <w:t xml:space="preserve"> </w:t>
-      </w:r>
-      <w:r>
-        <w:rPr>
-          <w:rFonts w:ascii="Times New Roman" w:eastAsia="Times New Roman" w:hAnsi="Times New Roman" w:cs="Times New Roman"/>
-          <w:bCs/>
-          <w:lang w:eastAsia="pt-BR"/>
-        </w:rPr>
-        <w:t xml:space="preserve">valores </w:t>
-      </w:r>
-      <w:r>
-        <w:rPr>
-          <w:rFonts w:ascii="Times New Roman" w:eastAsia="Times New Roman" w:hAnsi="Times New Roman" w:cs="Times New Roman"/>
-          <w:b/>
-          <w:bCs/>
-          <w:color w:val="00B050"/>
-          <w:lang w:eastAsia="pt-BR"/>
-        </w:rPr>
-        <w:t>menores</w:t>
-      </w:r>
-      <w:r>
-        <w:rPr>
-          <w:rFonts w:ascii="Times New Roman" w:eastAsia="Times New Roman" w:hAnsi="Times New Roman" w:cs="Times New Roman"/>
-          <w:bCs/>
-          <w:color w:val="00B050"/>
-          <w:lang w:eastAsia="pt-BR"/>
-        </w:rPr>
-        <w:t xml:space="preserve"> </w:t>
-      </w:r>
-      <w:r>
-        <w:rPr>
-          <w:rFonts w:ascii="Times New Roman" w:eastAsia="Times New Roman" w:hAnsi="Times New Roman" w:cs="Times New Roman"/>
-          <w:bCs/>
-          <w:lang w:eastAsia="pt-BR"/>
-        </w:rPr>
-        <w:t>que original;</w:t>
-      </w:r>
-    </w:p>
-    <w:p>
-      <w:pPr>
-        <w:pStyle w:val="PargrafodaLista"/>
-        <w:numPr>
-          <w:ilvl w:val="0"/>
-          <w:numId w:val="28"/>
-        </w:numPr>
-        <w:spacing w:after="0"/>
-        <w:rPr>
-          <w:rFonts w:ascii="Times New Roman" w:eastAsia="Times New Roman" w:hAnsi="Times New Roman" w:cs="Times New Roman"/>
-          <w:b/>
-          <w:bCs/>
-          <w:color w:val="FF0000"/>
-          <w:lang w:eastAsia="pt-BR"/>
-        </w:rPr>
-      </w:pPr>
-      <w:r>
-        <w:rPr>
-          <w:rFonts w:ascii="Times New Roman" w:eastAsia="Times New Roman" w:hAnsi="Times New Roman" w:cs="Times New Roman"/>
-          <w:bCs/>
-          <w:lang w:eastAsia="pt-BR"/>
-        </w:rPr>
-        <w:t xml:space="preserve">Para </w:t>
-      </w:r>
-      <w:r>
-        <w:rPr>
-          <w:rFonts w:ascii="Times New Roman" w:eastAsia="Times New Roman" w:hAnsi="Times New Roman" w:cs="Times New Roman"/>
-          <w:b/>
-          <w:bCs/>
-          <w:color w:val="00B0F0"/>
-          <w:lang w:eastAsia="pt-BR"/>
-        </w:rPr>
-        <w:t>baixo</w:t>
-      </w:r>
-      <w:r>
-        <w:rPr>
-          <w:rFonts w:ascii="Times New Roman" w:eastAsia="Times New Roman" w:hAnsi="Times New Roman" w:cs="Times New Roman"/>
-          <w:bCs/>
-          <w:lang w:eastAsia="pt-BR"/>
-        </w:rPr>
-        <w:t>:</w:t>
-      </w:r>
-      <w:r>
-        <w:rPr>
-          <w:rFonts w:ascii="Times New Roman" w:eastAsia="Times New Roman" w:hAnsi="Times New Roman" w:cs="Times New Roman"/>
-          <w:bCs/>
-          <w:color w:val="FF0000"/>
-          <w:lang w:eastAsia="pt-BR"/>
-        </w:rPr>
-        <w:t xml:space="preserve"> </w:t>
-      </w:r>
-      <w:r>
-        <w:rPr>
-          <w:rFonts w:ascii="Times New Roman" w:eastAsia="Times New Roman" w:hAnsi="Times New Roman" w:cs="Times New Roman"/>
-          <w:bCs/>
-          <w:lang w:eastAsia="pt-BR"/>
-        </w:rPr>
-        <w:t xml:space="preserve">valores </w:t>
-      </w:r>
-      <w:r>
-        <w:rPr>
-          <w:rFonts w:ascii="Times New Roman" w:eastAsia="Times New Roman" w:hAnsi="Times New Roman" w:cs="Times New Roman"/>
-          <w:b/>
-          <w:bCs/>
-          <w:color w:val="00B0F0"/>
-          <w:lang w:eastAsia="pt-BR"/>
-        </w:rPr>
-        <w:t>maiores</w:t>
-      </w:r>
-      <w:r>
-        <w:rPr>
-          <w:rFonts w:ascii="Times New Roman" w:eastAsia="Times New Roman" w:hAnsi="Times New Roman" w:cs="Times New Roman"/>
-          <w:bCs/>
-          <w:color w:val="00B0F0"/>
-          <w:lang w:eastAsia="pt-BR"/>
-        </w:rPr>
-        <w:t xml:space="preserve"> </w:t>
-      </w:r>
-      <w:r>
-        <w:rPr>
-          <w:rFonts w:ascii="Times New Roman" w:eastAsia="Times New Roman" w:hAnsi="Times New Roman" w:cs="Times New Roman"/>
-          <w:bCs/>
-          <w:lang w:eastAsia="pt-BR"/>
-        </w:rPr>
-        <w:t>que original</w:t>
-      </w:r>
-      <w:r>
-        <w:rPr>
-          <w:rFonts w:ascii="Times New Roman" w:eastAsia="Times New Roman" w:hAnsi="Times New Roman" w:cs="Times New Roman"/>
-          <w:b/>
-          <w:bCs/>
-          <w:lang w:eastAsia="pt-BR"/>
-        </w:rPr>
-        <w:t>;</w:t>
-      </w:r>
-    </w:p>
-    <w:p>
-      <w:pPr>
-        <w:pStyle w:val="PargrafodaLista"/>
-        <w:spacing w:after="0"/>
-        <w:rPr>
-          <w:rFonts w:ascii="Times New Roman" w:eastAsia="Times New Roman" w:hAnsi="Times New Roman" w:cs="Times New Roman"/>
-          <w:b/>
-          <w:bCs/>
-          <w:color w:val="FF0000"/>
-          <w:lang w:eastAsia="pt-BR"/>
-        </w:rPr>
-      </w:pPr>
-    </w:p>
-    <w:p>
-      <w:pPr>
-        <w:numPr>
-          <w:ilvl w:val="0"/>
-          <w:numId w:val="4"/>
-        </w:numPr>
-      </w:pPr>
-      <w:r>
-        <w:rPr>
-          <w:rFonts w:ascii="Segoe UI Emoji" w:hAnsi="Segoe UI Emoji" w:cs="Segoe UI Emoji"/>
-        </w:rPr>
-        <w:t>📌</w:t>
-      </w:r>
-      <w:r>
-        <w:t xml:space="preserve"> FLEXBOX/GRID – ORGANIZA LAYOUTS DE FORMA DINÂMICA</w:t>
-      </w:r>
-    </w:p>
-    <w:p>
-      <w:pPr>
-        <w:spacing w:after="0"/>
-        <w:ind w:left="360"/>
-        <w:rPr>
-          <w:rFonts w:eastAsia="Times New Roman"/>
-          <w:lang w:eastAsia="pt-BR"/>
-        </w:rPr>
-      </w:pPr>
+          <w:rFonts w:eastAsia="Times New Roman"/>
+          <w:color w:val="004E9A"/>
+          <w:lang w:eastAsia="pt-BR"/>
+        </w:rPr>
+        <w:t xml:space="preserve">: </w:t>
+      </w:r>
+      <w:r>
+        <w:rPr>
+          <w:rFonts w:eastAsia="Times New Roman"/>
+          <w:lang w:eastAsia="pt-BR"/>
+        </w:rPr>
+        <w:t xml:space="preserve">Define como o elemento será exibido na página (comportamento no </w:t>
+      </w:r>
       <w:proofErr w:type="gramStart"/>
       <w:r>
         <w:rPr>
           <w:rFonts w:eastAsia="Times New Roman"/>
-          <w:color w:val="004E9A"/>
-          <w:lang w:eastAsia="pt-BR"/>
-        </w:rPr>
-        <w:t>display</w:t>
+          <w:lang w:eastAsia="pt-BR"/>
+        </w:rPr>
+        <w:t>layout</w:t>
       </w:r>
       <w:proofErr w:type="gramEnd"/>
       <w:r>
         <w:rPr>
           <w:rFonts w:eastAsia="Times New Roman"/>
-          <w:color w:val="004E9A"/>
-          <w:lang w:eastAsia="pt-BR"/>
-        </w:rPr>
-        <w:t xml:space="preserve">: </w:t>
-      </w:r>
-      <w:r>
-        <w:rPr>
-          <w:rFonts w:eastAsia="Times New Roman"/>
-          <w:lang w:eastAsia="pt-BR"/>
-        </w:rPr>
-        <w:t>Define como o elemento será exibido na página (comportamento no layout).</w:t>
+          <w:lang w:eastAsia="pt-BR"/>
+        </w:rPr>
+        <w:t>).</w:t>
       </w:r>
     </w:p>
     <w:p>
@@ -2719,7 +2761,6 @@
           <w:color w:val="004E9A"/>
           <w:lang w:eastAsia="pt-BR"/>
         </w:rPr>
-        <w:lastRenderedPageBreak/>
         <w:t>inline</w:t>
       </w:r>
       <w:proofErr w:type="spellEnd"/>
@@ -2987,7 +3028,7 @@
                     <pic:cNvPicPr/>
                   </pic:nvPicPr>
                   <pic:blipFill>
-                    <a:blip r:embed="rId8">
+                    <a:blip r:embed="rId9">
                       <a:extLst>
                         <a:ext uri="{28A0092B-C50C-407E-A947-70E740481C1C}">
                           <a14:useLocalDpi xmlns:a14="http://schemas.microsoft.com/office/drawing/2010/main" val="0"/>
@@ -3165,7 +3206,7 @@
                     <pic:cNvPicPr/>
                   </pic:nvPicPr>
                   <pic:blipFill>
-                    <a:blip r:embed="rId9">
+                    <a:blip r:embed="rId10">
                       <a:extLst>
                         <a:ext uri="{28A0092B-C50C-407E-A947-70E740481C1C}">
                           <a14:useLocalDpi xmlns:a14="http://schemas.microsoft.com/office/drawing/2010/main" val="0"/>
@@ -3743,7 +3784,6 @@
           <w:color w:val="ED0000"/>
           <w:lang w:eastAsia="pt-BR"/>
         </w:rPr>
-        <w:lastRenderedPageBreak/>
         <w:t>left</w:t>
       </w:r>
       <w:proofErr w:type="spellEnd"/>
@@ -5402,6 +5442,7 @@
           <w:kern w:val="0"/>
           <w:lang w:eastAsia="pt-BR"/>
         </w:rPr>
+        <w:lastRenderedPageBreak/>
         <mc:AlternateContent>
           <mc:Choice Requires="wpg">
             <w:drawing>
@@ -5961,7 +6002,6 @@
           <w:lang w:eastAsia="pt-BR"/>
           <w14:ligatures w14:val="none"/>
         </w:rPr>
-        <w:lastRenderedPageBreak/>
         <w:t>font</w:t>
       </w:r>
       <w:proofErr w:type="spellEnd"/>
@@ -7892,6 +7932,7 @@
           <w:lang w:eastAsia="pt-BR"/>
           <w14:ligatures w14:val="none"/>
         </w:rPr>
+        <w:lastRenderedPageBreak/>
         <w:t>obs</w:t>
       </w:r>
       <w:proofErr w:type="spellEnd"/>
@@ -8110,7 +8151,7 @@
                     <pic:cNvPicPr/>
                   </pic:nvPicPr>
                   <pic:blipFill>
-                    <a:blip r:embed="rId10">
+                    <a:blip r:embed="rId11">
                       <a:extLst>
                         <a:ext uri="{28A0092B-C50C-407E-A947-70E740481C1C}">
                           <a14:useLocalDpi xmlns:a14="http://schemas.microsoft.com/office/drawing/2010/main" val="0"/>
@@ -8171,7 +8212,7 @@
                     <pic:cNvPicPr/>
                   </pic:nvPicPr>
                   <pic:blipFill>
-                    <a:blip r:embed="rId11">
+                    <a:blip r:embed="rId12">
                       <a:extLst>
                         <a:ext uri="{28A0092B-C50C-407E-A947-70E740481C1C}">
                           <a14:useLocalDpi xmlns:a14="http://schemas.microsoft.com/office/drawing/2010/main" val="0"/>
@@ -10300,7 +10341,6 @@
           <w:color w:val="007BB8"/>
           <w:lang w:eastAsia="pt-BR"/>
         </w:rPr>
-        <w:lastRenderedPageBreak/>
         <w:t>scrol</w:t>
       </w:r>
       <w:r>
@@ -11839,6 +11879,7 @@
           <w:kern w:val="0"/>
           <w:lang w:eastAsia="pt-BR"/>
         </w:rPr>
+        <w:lastRenderedPageBreak/>
         <mc:AlternateContent>
           <mc:Choice Requires="wpg">
             <w:drawing>
@@ -12275,7 +12316,6 @@
           <w:color w:val="0070C0"/>
           <w:lang w:eastAsia="pt-BR"/>
         </w:rPr>
-        <w:lastRenderedPageBreak/>
         <w:t>border</w:t>
       </w:r>
       <w:proofErr w:type="gramEnd"/>
@@ -14034,6 +14074,7 @@
           <w:color w:val="007BB8"/>
           <w:lang w:eastAsia="pt-BR"/>
         </w:rPr>
+        <w:lastRenderedPageBreak/>
         <w:t>scale</w:t>
       </w:r>
       <w:proofErr w:type="spellEnd"/>
@@ -14354,7 +14395,6 @@
           <w:rFonts w:ascii="Times New Roman" w:eastAsia="Times New Roman" w:hAnsi="Times New Roman" w:cs="Times New Roman"/>
           <w:lang w:eastAsia="pt-BR"/>
         </w:rPr>
-        <w:lastRenderedPageBreak/>
         <w:t>Observação: As opções da tabela abaixo aparecem para todos os tipos de transição listados acima</w:t>
       </w:r>
     </w:p>
@@ -14400,7 +14440,7 @@
                     <pic:cNvPicPr/>
                   </pic:nvPicPr>
                   <pic:blipFill>
-                    <a:blip r:embed="rId12">
+                    <a:blip r:embed="rId13">
                       <a:extLst>
                         <a:ext uri="{28A0092B-C50C-407E-A947-70E740481C1C}">
                           <a14:useLocalDpi xmlns:a14="http://schemas.microsoft.com/office/drawing/2010/main" val="0"/>
@@ -15839,7 +15879,7 @@
                     <pic:cNvPicPr/>
                   </pic:nvPicPr>
                   <pic:blipFill>
-                    <a:blip r:embed="rId13"/>
+                    <a:blip r:embed="rId14"/>
                     <a:stretch>
                       <a:fillRect/>
                     </a:stretch>
@@ -15871,6 +15911,7 @@
           <w:kern w:val="0"/>
           <w:lang w:eastAsia="pt-BR"/>
         </w:rPr>
+        <w:lastRenderedPageBreak/>
         <mc:AlternateContent>
           <mc:Choice Requires="wpg">
             <w:drawing>
@@ -16190,7 +16231,6 @@
           <w:rFonts w:eastAsia="Times New Roman"/>
           <w:lang w:eastAsia="pt-BR"/>
         </w:rPr>
-        <w:lastRenderedPageBreak/>
         <w:t>Serve para destacar ou tratar um único item.</w:t>
       </w:r>
     </w:p>
@@ -16378,7 +16418,7 @@
                     <pic:cNvPicPr/>
                   </pic:nvPicPr>
                   <pic:blipFill>
-                    <a:blip r:embed="rId14">
+                    <a:blip r:embed="rId15">
                       <a:extLst>
                         <a:ext uri="{28A0092B-C50C-407E-A947-70E740481C1C}">
                           <a14:useLocalDpi xmlns:a14="http://schemas.microsoft.com/office/drawing/2010/main" val="0"/>
@@ -16540,7 +16580,7 @@
                     <pic:cNvPicPr/>
                   </pic:nvPicPr>
                   <pic:blipFill>
-                    <a:blip r:embed="rId15">
+                    <a:blip r:embed="rId16">
                       <a:extLst>
                         <a:ext uri="{28A0092B-C50C-407E-A947-70E740481C1C}">
                           <a14:useLocalDpi xmlns:a14="http://schemas.microsoft.com/office/drawing/2010/main" val="0"/>
@@ -17117,7 +17157,7 @@
                           </pic:cNvPicPr>
                         </pic:nvPicPr>
                         <pic:blipFill>
-                          <a:blip r:embed="rId16">
+                          <a:blip r:embed="rId17">
                             <a:extLst>
                               <a:ext uri="{28A0092B-C50C-407E-A947-70E740481C1C}">
                                 <a14:useLocalDpi xmlns:a14="http://schemas.microsoft.com/office/drawing/2010/main" val="0"/>
@@ -17146,7 +17186,7 @@
                           </pic:cNvPicPr>
                         </pic:nvPicPr>
                         <pic:blipFill>
-                          <a:blip r:embed="rId17">
+                          <a:blip r:embed="rId18">
                             <a:extLst>
                               <a:ext uri="{28A0092B-C50C-407E-A947-70E740481C1C}">
                                 <a14:useLocalDpi xmlns:a14="http://schemas.microsoft.com/office/drawing/2010/main" val="0"/>
@@ -17176,7 +17216,7 @@
               </wp:anchor>
             </w:drawing>
           </mc:Choice>
-          <mc:Fallback xmlns:w16se="http://schemas.microsoft.com/office/word/2015/wordml/symex" xmlns:w16sdtfl="http://schemas.microsoft.com/office/word/2024/wordml/sdtformatlock" xmlns:w16sdtdh="http://schemas.microsoft.com/office/word/2020/wordml/sdtdatahash" xmlns:w16du="http://schemas.microsoft.com/office/word/2023/wordml/word16du" xmlns:w16="http://schemas.microsoft.com/office/word/2018/wordml" xmlns:w16cid="http://schemas.microsoft.com/office/word/2016/wordml/cid" xmlns:w16cex="http://schemas.microsoft.com/office/word/2018/wordml/cex" xmlns:w15="http://schemas.microsoft.com/office/word/2012/wordml" xmlns:oel="http://schemas.microsoft.com/office/2019/extlst" xmlns:am3d="http://schemas.microsoft.com/office/drawing/2017/model3d" xmlns:aink="http://schemas.microsoft.com/office/drawing/2016/ink" xmlns:cx8="http://schemas.microsoft.com/office/drawing/2016/5/14/chartex" xmlns:cx7="http://schemas.microsoft.com/office/drawing/2016/5/13/chartex" xmlns:cx6="http://schemas.microsoft.com/office/drawing/2016/5/12/chartex" xmlns:cx5="http://schemas.microsoft.com/office/drawing/2016/5/11/chartex" xmlns:cx4="http://schemas.microsoft.com/office/drawing/2016/5/10/chartex" xmlns:cx3="http://schemas.microsoft.com/office/drawing/2016/5/9/chartex" xmlns:cx2="http://schemas.microsoft.com/office/drawing/2015/10/21/chartex" xmlns:cx1="http://schemas.microsoft.com/office/drawing/2015/9/8/chartex" xmlns:cx="http://schemas.microsoft.com/office/drawing/2014/chartex">
+          <mc:Fallback xmlns:cx="http://schemas.microsoft.com/office/drawing/2014/chartex" xmlns:cx1="http://schemas.microsoft.com/office/drawing/2015/9/8/chartex" xmlns:cx2="http://schemas.microsoft.com/office/drawing/2015/10/21/chartex" xmlns:cx3="http://schemas.microsoft.com/office/drawing/2016/5/9/chartex" xmlns:cx4="http://schemas.microsoft.com/office/drawing/2016/5/10/chartex" xmlns:cx5="http://schemas.microsoft.com/office/drawing/2016/5/11/chartex" xmlns:cx6="http://schemas.microsoft.com/office/drawing/2016/5/12/chartex" xmlns:cx7="http://schemas.microsoft.com/office/drawing/2016/5/13/chartex" xmlns:cx8="http://schemas.microsoft.com/office/drawing/2016/5/14/chartex" xmlns:aink="http://schemas.microsoft.com/office/drawing/2016/ink" xmlns:am3d="http://schemas.microsoft.com/office/drawing/2017/model3d" xmlns:oel="http://schemas.microsoft.com/office/2019/extlst" xmlns:w15="http://schemas.microsoft.com/office/word/2012/wordml" xmlns:w16cex="http://schemas.microsoft.com/office/word/2018/wordml/cex" xmlns:w16cid="http://schemas.microsoft.com/office/word/2016/wordml/cid" xmlns:w16="http://schemas.microsoft.com/office/word/2018/wordml" xmlns:w16du="http://schemas.microsoft.com/office/word/2023/wordml/word16du" xmlns:w16sdtdh="http://schemas.microsoft.com/office/word/2020/wordml/sdtdatahash" xmlns:w16sdtfl="http://schemas.microsoft.com/office/word/2024/wordml/sdtformatlock" xmlns:w16se="http://schemas.microsoft.com/office/word/2015/wordml/symex">
             <w:pict>
               <v:group w14:anchorId="4E6A5D1C" id="Agrupar 5" o:spid="_x0000_s1026" style="position:absolute;margin-left:22.95pt;margin-top:.8pt;width:423.25pt;height:91.45pt;z-index:-251638784;mso-height-relative:margin" coordorigin=",444" coordsize="53752,11614" o:gfxdata="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">
                 <v:shapetype id="_x0000_t75" coordsize="21600,21600" o:spt="75" o:preferrelative="t" path="m@4@5l@4@11@9@11@9@5xe" filled="f" stroked="f">
@@ -17199,10 +17239,10 @@
                   <o:lock v:ext="edit" aspectratio="t"/>
                 </v:shapetype>
                 <v:shape id="Imagem 1" o:spid="_x0000_s1027" type="#_x0000_t75" style="position:absolute;top:3048;width:31146;height:9010;visibility:visible;mso-wrap-style:square" o:gfxdata="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">
-                  <v:imagedata r:id="rId18" o:title=""/>
+                  <v:imagedata r:id="rId19" o:title=""/>
                 </v:shape>
                 <v:shape id="Imagem 1" o:spid="_x0000_s1028" type="#_x0000_t75" style="position:absolute;left:38957;top:444;width:14795;height:11614;visibility:visible;mso-wrap-style:square" o:gfxdata="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">
-                  <v:imagedata r:id="rId19" o:title=""/>
+                  <v:imagedata r:id="rId20" o:title=""/>
                 </v:shape>
               </v:group>
             </w:pict>
@@ -17283,6 +17323,7 @@
           <w:color w:val="004F88"/>
           <w:lang w:eastAsia="pt-BR"/>
         </w:rPr>
+        <w:lastRenderedPageBreak/>
         <w:t xml:space="preserve">PSEUDOCLASSES </w:t>
       </w:r>
       <w:r>
@@ -17635,7 +17676,6 @@
           <w:color w:val="004F88"/>
           <w:lang w:eastAsia="pt-BR"/>
         </w:rPr>
-        <w:lastRenderedPageBreak/>
         <w:t>:</w:t>
       </w:r>
       <w:proofErr w:type="spellStart"/>
@@ -18106,7 +18146,7 @@
                     <pic:cNvPicPr/>
                   </pic:nvPicPr>
                   <pic:blipFill>
-                    <a:blip r:embed="rId20">
+                    <a:blip r:embed="rId21">
                       <a:extLst>
                         <a:ext uri="{28A0092B-C50C-407E-A947-70E740481C1C}">
                           <a14:useLocalDpi xmlns:a14="http://schemas.microsoft.com/office/drawing/2010/main" val="0"/>
@@ -18434,7 +18474,7 @@
                     <pic:cNvPicPr/>
                   </pic:nvPicPr>
                   <pic:blipFill>
-                    <a:blip r:embed="rId21">
+                    <a:blip r:embed="rId22">
                       <a:extLst>
                         <a:ext uri="{28A0092B-C50C-407E-A947-70E740481C1C}">
                           <a14:useLocalDpi xmlns:a14="http://schemas.microsoft.com/office/drawing/2010/main" val="0"/>
@@ -18631,6 +18671,7 @@
           <w:rFonts w:ascii="Times New Roman" w:eastAsia="Times New Roman" w:hAnsi="Times New Roman" w:cs="Times New Roman"/>
           <w:lang w:eastAsia="pt-BR"/>
         </w:rPr>
+        <w:lastRenderedPageBreak/>
         <w:t xml:space="preserve">Permite </w:t>
       </w:r>
       <w:proofErr w:type="spellStart"/>
@@ -19387,7 +19428,6 @@
           <w:lang w:eastAsia="pt-BR"/>
           <w14:ligatures w14:val="none"/>
         </w:rPr>
-        <w:lastRenderedPageBreak/>
         <w:t>&lt;</w:t>
       </w:r>
       <w:proofErr w:type="spellStart"/>
@@ -21609,6 +21649,7 @@
           <w:lang w:eastAsia="pt-BR"/>
           <w14:ligatures w14:val="none"/>
         </w:rPr>
+        <w:lastRenderedPageBreak/>
         <w:t>&lt;i&gt;</w:t>
       </w:r>
       <w:r>
@@ -22414,7 +22455,6 @@
           <w:lang w:eastAsia="pt-BR"/>
           <w14:ligatures w14:val="none"/>
         </w:rPr>
-        <w:lastRenderedPageBreak/>
         <w:t>&lt;</w:t>
       </w:r>
       <w:proofErr w:type="spellStart"/>
@@ -28296,7 +28336,7 @@
   <a:extraClrSchemeLst/>
   <a:extLst>
     <a:ext uri="{05A4C25C-085E-4340-85A3-A5531E510DB2}">
-      <thm15:themeFamily xmlns:thm15="http://schemas.microsoft.com/office/thememl/2012/main" xmlns="" name="Office Theme" id="{62F939B6-93AF-4DB8-9C6B-D6C7DFDC589F}" vid="{4A3C46E8-61CC-4603-A589-7422A47A8E4A}"/>
+      <thm15:themeFamily xmlns="" xmlns:thm15="http://schemas.microsoft.com/office/thememl/2012/main" name="Office Theme" id="{62F939B6-93AF-4DB8-9C6B-D6C7DFDC589F}" vid="{4A3C46E8-61CC-4603-A589-7422A47A8E4A}"/>
     </a:ext>
   </a:extLst>
 </a:theme>

</xml_diff>